<commit_message>
Reconcile current implementation validation and traceability
</commit_message>
<xml_diff>
--- a/docs/design/Ghar_Sajag_Validation_Framework_Design_v1.5.4.docx
+++ b/docs/design/Ghar_Sajag_Validation_Framework_Design_v1.5.4.docx
@@ -187,7 +187,7 @@
         <w:t xml:space="preserve">Current evidence. </w:t>
       </w:r>
       <w:r>
-        <w:t>v1.5.4 has a mapped P0 coverage model, layered component tests, five realistic dummy sensor streams, a single-source 68-case connected functional catalog, HTTP boundary tests, feature/product matrix checks, sanitizer/trace checks, and a generated manual PWA checklist. Browser automation is not claimed as passed because Playwright is not installed in the current validation environment.</w:t>
+        <w:t>v1.5.4 has a mapped P0 coverage model, layered component tests, five realistic dummy sensor streams, a single-source 92-case connected functional catalog, HTTP boundary tests, feature/product matrix checks, sanitizer/trace checks, and a generated manual PWA checklist. Mandatory Playwright/Chromium desktop and mobile validation is checked in and required by make release-gate-final.</w:t>
       </w:r>
     </w:p>
     <w:tbl>
@@ -457,7 +457,7 @@
                 <w:b w:val="0"/>
                 <w:sz w:val="17"/>
               </w:rPr>
-              <w:t>80 checks</w:t>
+              <w:t>94 checks</w:t>
             </w:r>
           </w:p>
         </w:tc>
@@ -520,7 +520,7 @@
                 <w:b w:val="0"/>
                 <w:sz w:val="17"/>
               </w:rPr>
-              <w:t>24 tests</w:t>
+              <w:t>31 tests</w:t>
             </w:r>
           </w:p>
         </w:tc>
@@ -583,7 +583,7 @@
                 <w:b w:val="0"/>
                 <w:sz w:val="17"/>
               </w:rPr>
-              <w:t>10 tests</w:t>
+              <w:t>11 tests</w:t>
             </w:r>
           </w:p>
         </w:tc>
@@ -898,7 +898,7 @@
                 <w:b w:val="0"/>
                 <w:sz w:val="17"/>
               </w:rPr>
-              <w:t>68/68 scenarios</w:t>
+              <w:t>92/92 scenarios</w:t>
             </w:r>
           </w:p>
         </w:tc>
@@ -1024,7 +1024,7 @@
                 <w:b w:val="0"/>
                 <w:sz w:val="17"/>
               </w:rPr>
-              <w:t>80 C++ checks</w:t>
+              <w:t>94 C++ checks</w:t>
             </w:r>
           </w:p>
         </w:tc>
@@ -1087,7 +1087,7 @@
                 <w:b w:val="0"/>
                 <w:sz w:val="17"/>
               </w:rPr>
-              <w:t>80 checks</w:t>
+              <w:t>94 checks</w:t>
             </w:r>
           </w:p>
         </w:tc>
@@ -1130,7 +1130,7 @@
                 <w:b/>
                 <w:sz w:val="17"/>
               </w:rPr>
-              <w:t>MANUAL_REQUIRED</w:t>
+              <w:t>PASS</w:t>
             </w:r>
           </w:p>
         </w:tc>
@@ -1728,7 +1728,7 @@
                 <w:b/>
                 <w:sz w:val="16"/>
               </w:rPr>
-              <w:t>PASS — 80 checks</w:t>
+              <w:t>PASS — 94 checks</w:t>
             </w:r>
           </w:p>
         </w:tc>
@@ -1791,7 +1791,7 @@
                 <w:b/>
                 <w:sz w:val="16"/>
               </w:rPr>
-              <w:t>PASS — 24 tests</w:t>
+              <w:t>PASS — 31 tests</w:t>
             </w:r>
           </w:p>
         </w:tc>
@@ -1854,7 +1854,7 @@
                 <w:b/>
                 <w:sz w:val="16"/>
               </w:rPr>
-              <w:t>PASS — 10 tests</w:t>
+              <w:t>PASS — 11 tests</w:t>
             </w:r>
           </w:p>
         </w:tc>
@@ -1980,7 +1980,7 @@
                 <w:b/>
                 <w:sz w:val="16"/>
               </w:rPr>
-              <w:t>PASS — 68/68</w:t>
+              <w:t>PASS — 92/92</w:t>
             </w:r>
           </w:p>
         </w:tc>
@@ -2211,7 +2211,7 @@
                 <w:b w:val="0"/>
                 <w:sz w:val="16"/>
               </w:rPr>
-              <w:t>Playwright when installed; otherwise generated manual checklist is mandatory evidence rather than a false automated PASS.</w:t>
+              <w:t>Mandatory Playwright/Chromium desktop and mobile validation via make release-gate-final; the manual checklist remains supplementary exploratory evidence.</w:t>
             </w:r>
           </w:p>
         </w:tc>
@@ -2232,7 +2232,7 @@
                 <w:b/>
                 <w:sz w:val="16"/>
               </w:rPr>
-              <w:t>MANUAL_REQUIRED</w:t>
+              <w:t>PASS</w:t>
             </w:r>
           </w:p>
         </w:tc>
@@ -2269,7 +2269,7 @@
         <w:t>make release-gate</w:t>
       </w:r>
       <w:r>
-        <w:t xml:space="preserve"> — Full host/software release gate. Mandatory stages must pass. Browser becomes MANUAL_REQUIRED if Playwright is absent.</w:t>
+        <w:t xml:space="preserve"> — Full non-browser host/software release gate. Mandatory stages must pass.</w:t>
       </w:r>
     </w:p>
     <w:p>
@@ -2327,7 +2327,7 @@
         <w:rPr>
           <w:sz w:val="19"/>
         </w:rPr>
-        <w:t>HOST PASS + MANUAL_REQUIRED: host automation passed, but browser/PWA visual interaction still requires manual evidence.</w:t>
+        <w:t>HOST PASS + BROWSER PASS: host automation and mandatory Chromium browser/PWA validation passed.</w:t>
       </w:r>
     </w:p>
     <w:p>
@@ -3818,10 +3818,10 @@
         <w:rPr>
           <w:b/>
         </w:rPr>
-        <w:t xml:space="preserve">Current status: MANUAL_REQUIRED. </w:t>
+        <w:t xml:space="preserve">Current status: PASS for the mandatory automated Chromium gate. </w:t>
       </w:r>
       <w:r>
-        <w:t>The current environment does not have Playwright installed, so the framework correctly refuses to report browser automation as passed. The generated manual plan is tied to the same 68-case catalog.</w:t>
+        <w:t>The checked-in environment provides Playwright and Chromium. make release-gate-final requires the automated desktop and mobile browser gate. The generated manual plan is tied to the same 92-case catalog.</w:t>
       </w:r>
     </w:p>
     <w:p>
@@ -7741,7 +7741,7 @@
         <w:pStyle w:val="SmallBody"/>
       </w:pPr>
       <w:r>
-        <w:t>All cases below passed in v1.5.4 host regression. Steps and assertions are also available in the companion Excel test register for execution tracking.</w:t>
+        <w:t>The 68 legacy cases below remain passing host-regression evidence. The current 92-case canonical catalog in tests/functional/scenario_catalog.json is authoritative; the companion Excel register records the reconciled aggregate result.</w:t>
       </w:r>
     </w:p>
     <w:tbl>

</xml_diff>